<commit_message>
compte rendu à jour
</commit_message>
<xml_diff>
--- a/Compte_rendu_des_rencontres+suivi.docx
+++ b/Compte_rendu_des_rencontres+suivi.docx
@@ -2997,7 +2997,21 @@
           <w:sz w:val="40"/>
           <w:szCs w:val="40"/>
         </w:rPr>
-        <w:t>crées</w:t>
+        <w:t>cré</w:t>
+      </w:r>
+      <w:r>
+        <w:rPr>
+          <w:sz w:val="40"/>
+          <w:szCs w:val="40"/>
+        </w:rPr>
+        <w:t>e</w:t>
+      </w:r>
+      <w:r>
+        <w:rPr>
+          <w:sz w:val="40"/>
+          <w:szCs w:val="40"/>
+        </w:rPr>
+        <w:t>s</w:t>
       </w:r>
       <w:proofErr w:type="spellEnd"/>
       <w:proofErr w:type="gramEnd"/>

</xml_diff>

<commit_message>
mise à jour du compte rendu
</commit_message>
<xml_diff>
--- a/Compte_rendu_des_rencontres+suivi.docx
+++ b/Compte_rendu_des_rencontres+suivi.docx
@@ -744,7 +744,7 @@
       <w:pPr>
         <w:spacing w:after="120" w:line="276" w:lineRule="auto"/>
         <w:rPr>
-          <w:rFonts w:ascii="Segoe UI Symbol" w:eastAsia="Segoe UI Symbol" w:hAnsi="Segoe UI Symbol" w:hint="eastAsia"/>
+          <w:rFonts w:ascii="Segoe UI Symbol" w:eastAsia="Segoe UI Symbol" w:hAnsi="Segoe UI Symbol"/>
           <w:lang w:eastAsia="ja-JP"/>
         </w:rPr>
       </w:pPr>
@@ -780,12 +780,6 @@
         <w:gridCol w:w="1910"/>
       </w:tblGrid>
       <w:tr>
-        <w:tblPrEx>
-          <w:tblCellMar>
-            <w:top w:w="0" w:type="dxa"/>
-            <w:bottom w:w="0" w:type="dxa"/>
-          </w:tblCellMar>
-        </w:tblPrEx>
         <w:trPr>
           <w:tblHeader/>
         </w:trPr>
@@ -903,12 +897,6 @@
         </w:tc>
       </w:tr>
       <w:tr>
-        <w:tblPrEx>
-          <w:tblCellMar>
-            <w:top w:w="0" w:type="dxa"/>
-            <w:bottom w:w="0" w:type="dxa"/>
-          </w:tblCellMar>
-        </w:tblPrEx>
         <w:tc>
           <w:tcPr>
             <w:tcW w:w="1450" w:type="dxa"/>
@@ -1120,12 +1108,6 @@
         </w:tc>
       </w:tr>
       <w:tr>
-        <w:tblPrEx>
-          <w:tblCellMar>
-            <w:top w:w="0" w:type="dxa"/>
-            <w:bottom w:w="0" w:type="dxa"/>
-          </w:tblCellMar>
-        </w:tblPrEx>
         <w:tc>
           <w:tcPr>
             <w:tcW w:w="1450" w:type="dxa"/>
@@ -1295,12 +1277,6 @@
         </w:tc>
       </w:tr>
       <w:tr>
-        <w:tblPrEx>
-          <w:tblCellMar>
-            <w:top w:w="0" w:type="dxa"/>
-            <w:bottom w:w="0" w:type="dxa"/>
-          </w:tblCellMar>
-        </w:tblPrEx>
         <w:tc>
           <w:tcPr>
             <w:tcW w:w="1450" w:type="dxa"/>
@@ -1432,12 +1408,6 @@
         </w:tc>
       </w:tr>
       <w:tr>
-        <w:tblPrEx>
-          <w:tblCellMar>
-            <w:top w:w="0" w:type="dxa"/>
-            <w:bottom w:w="0" w:type="dxa"/>
-          </w:tblCellMar>
-        </w:tblPrEx>
         <w:tc>
           <w:tcPr>
             <w:tcW w:w="1450" w:type="dxa"/>
@@ -1598,23 +1568,12 @@
               <w:spacing w:before="30" w:after="30" w:line="250" w:lineRule="auto"/>
             </w:pPr>
             <w:r>
-              <w:rPr>
-                <w:rFonts w:eastAsia="Calibri"/>
-                <w:sz w:val="16"/>
-                <w:szCs w:val="16"/>
-              </w:rPr>
-              <w:t>À attribuer</w:t>
+              <w:t>Christian</w:t>
             </w:r>
           </w:p>
         </w:tc>
       </w:tr>
       <w:tr>
-        <w:tblPrEx>
-          <w:tblCellMar>
-            <w:top w:w="0" w:type="dxa"/>
-            <w:bottom w:w="0" w:type="dxa"/>
-          </w:tblCellMar>
-        </w:tblPrEx>
         <w:tc>
           <w:tcPr>
             <w:tcW w:w="1450" w:type="dxa"/>
@@ -1775,23 +1734,12 @@
               <w:spacing w:before="30" w:after="30" w:line="250" w:lineRule="auto"/>
             </w:pPr>
             <w:r>
-              <w:rPr>
-                <w:rFonts w:eastAsia="Calibri"/>
-                <w:sz w:val="16"/>
-                <w:szCs w:val="16"/>
-              </w:rPr>
-              <w:t>Jérémie Arno</w:t>
+              <w:t>Rayanne et Abdoul</w:t>
             </w:r>
           </w:p>
         </w:tc>
       </w:tr>
       <w:tr>
-        <w:tblPrEx>
-          <w:tblCellMar>
-            <w:top w:w="0" w:type="dxa"/>
-            <w:bottom w:w="0" w:type="dxa"/>
-          </w:tblCellMar>
-        </w:tblPrEx>
         <w:tc>
           <w:tcPr>
             <w:tcW w:w="1450" w:type="dxa"/>
@@ -1976,12 +1924,6 @@
         </w:tc>
       </w:tr>
       <w:tr>
-        <w:tblPrEx>
-          <w:tblCellMar>
-            <w:top w:w="0" w:type="dxa"/>
-            <w:bottom w:w="0" w:type="dxa"/>
-          </w:tblCellMar>
-        </w:tblPrEx>
         <w:tc>
           <w:tcPr>
             <w:tcW w:w="1450" w:type="dxa"/>
@@ -2218,12 +2160,6 @@
         </w:tc>
       </w:tr>
       <w:tr>
-        <w:tblPrEx>
-          <w:tblCellMar>
-            <w:top w:w="0" w:type="dxa"/>
-            <w:bottom w:w="0" w:type="dxa"/>
-          </w:tblCellMar>
-        </w:tblPrEx>
         <w:tc>
           <w:tcPr>
             <w:tcW w:w="1450" w:type="dxa"/>
@@ -2452,12 +2388,6 @@
         </w:tc>
       </w:tr>
       <w:tr>
-        <w:tblPrEx>
-          <w:tblCellMar>
-            <w:top w:w="0" w:type="dxa"/>
-            <w:bottom w:w="0" w:type="dxa"/>
-          </w:tblCellMar>
-        </w:tblPrEx>
         <w:tc>
           <w:tcPr>
             <w:tcW w:w="1450" w:type="dxa"/>
@@ -2630,24 +2560,15 @@
             <w:pPr>
               <w:spacing w:before="30" w:after="30" w:line="250" w:lineRule="auto"/>
             </w:pPr>
-            <w:r>
-              <w:rPr>
-                <w:rFonts w:eastAsia="Calibri"/>
-                <w:sz w:val="16"/>
-                <w:szCs w:val="16"/>
-              </w:rPr>
-              <w:t>Aboubacar</w:t>
-            </w:r>
+            <w:proofErr w:type="spellStart"/>
+            <w:r>
+              <w:t>wIlson</w:t>
+            </w:r>
+            <w:proofErr w:type="spellEnd"/>
           </w:p>
         </w:tc>
       </w:tr>
       <w:tr>
-        <w:tblPrEx>
-          <w:tblCellMar>
-            <w:top w:w="0" w:type="dxa"/>
-            <w:bottom w:w="0" w:type="dxa"/>
-          </w:tblCellMar>
-        </w:tblPrEx>
         <w:tc>
           <w:tcPr>
             <w:tcW w:w="1450" w:type="dxa"/>
@@ -2813,18 +2734,20 @@
                 <w:sz w:val="16"/>
                 <w:szCs w:val="16"/>
               </w:rPr>
-              <w:t>Christian</w:t>
+              <w:t>Christi</w:t>
+            </w:r>
+            <w:r>
+              <w:rPr>
+                <w:rFonts w:eastAsia="Calibri"/>
+                <w:sz w:val="16"/>
+                <w:szCs w:val="16"/>
+              </w:rPr>
+              <w:t>an et Jermie</w:t>
             </w:r>
           </w:p>
         </w:tc>
       </w:tr>
       <w:tr>
-        <w:tblPrEx>
-          <w:tblCellMar>
-            <w:top w:w="0" w:type="dxa"/>
-            <w:bottom w:w="0" w:type="dxa"/>
-          </w:tblCellMar>
-        </w:tblPrEx>
         <w:tc>
           <w:tcPr>
             <w:tcW w:w="1450" w:type="dxa"/>
@@ -3051,12 +2974,6 @@
         <w:gridCol w:w="3860"/>
       </w:tblGrid>
       <w:tr>
-        <w:tblPrEx>
-          <w:tblCellMar>
-            <w:top w:w="0" w:type="dxa"/>
-            <w:bottom w:w="0" w:type="dxa"/>
-          </w:tblCellMar>
-        </w:tblPrEx>
         <w:trPr>
           <w:tblHeader/>
         </w:trPr>
@@ -3146,12 +3063,6 @@
         </w:tc>
       </w:tr>
       <w:tr>
-        <w:tblPrEx>
-          <w:tblCellMar>
-            <w:top w:w="0" w:type="dxa"/>
-            <w:bottom w:w="0" w:type="dxa"/>
-          </w:tblCellMar>
-        </w:tblPrEx>
         <w:tc>
           <w:tcPr>
             <w:tcW w:w="1300" w:type="dxa"/>
@@ -3231,12 +3142,6 @@
         </w:tc>
       </w:tr>
       <w:tr>
-        <w:tblPrEx>
-          <w:tblCellMar>
-            <w:top w:w="0" w:type="dxa"/>
-            <w:bottom w:w="0" w:type="dxa"/>
-          </w:tblCellMar>
-        </w:tblPrEx>
         <w:tc>
           <w:tcPr>
             <w:tcW w:w="1300" w:type="dxa"/>
@@ -3316,12 +3221,6 @@
         </w:tc>
       </w:tr>
       <w:tr>
-        <w:tblPrEx>
-          <w:tblCellMar>
-            <w:top w:w="0" w:type="dxa"/>
-            <w:bottom w:w="0" w:type="dxa"/>
-          </w:tblCellMar>
-        </w:tblPrEx>
         <w:tc>
           <w:tcPr>
             <w:tcW w:w="1300" w:type="dxa"/>
@@ -3401,12 +3300,6 @@
         </w:tc>
       </w:tr>
       <w:tr>
-        <w:tblPrEx>
-          <w:tblCellMar>
-            <w:top w:w="0" w:type="dxa"/>
-            <w:bottom w:w="0" w:type="dxa"/>
-          </w:tblCellMar>
-        </w:tblPrEx>
         <w:tc>
           <w:tcPr>
             <w:tcW w:w="1300" w:type="dxa"/>
@@ -3486,12 +3379,6 @@
         </w:tc>
       </w:tr>
       <w:tr>
-        <w:tblPrEx>
-          <w:tblCellMar>
-            <w:top w:w="0" w:type="dxa"/>
-            <w:bottom w:w="0" w:type="dxa"/>
-          </w:tblCellMar>
-        </w:tblPrEx>
         <w:tc>
           <w:tcPr>
             <w:tcW w:w="1300" w:type="dxa"/>
@@ -3571,12 +3458,6 @@
         </w:tc>
       </w:tr>
       <w:tr>
-        <w:tblPrEx>
-          <w:tblCellMar>
-            <w:top w:w="0" w:type="dxa"/>
-            <w:bottom w:w="0" w:type="dxa"/>
-          </w:tblCellMar>
-        </w:tblPrEx>
         <w:tc>
           <w:tcPr>
             <w:tcW w:w="1300" w:type="dxa"/>
@@ -3923,6 +3804,9 @@
       <w:pStyle w:val="En-tte"/>
     </w:pPr>
     <w:r>
+      <w:rPr>
+        <w:noProof/>
+      </w:rPr>
       <w:drawing>
         <wp:anchor distT="0" distB="0" distL="114300" distR="114300" simplePos="0" relativeHeight="251660288" behindDoc="0" locked="0" layoutInCell="1" allowOverlap="1" wp14:anchorId="14B15859" wp14:editId="4D657BAA">
           <wp:simplePos x="0" y="0"/>
@@ -4877,6 +4761,7 @@
   <w:style w:type="character" w:default="1" w:styleId="Policepardfaut">
     <w:name w:val="Default Paragraph Font"/>
     <w:uiPriority w:val="1"/>
+    <w:semiHidden/>
     <w:unhideWhenUsed/>
   </w:style>
   <w:style w:type="table" w:default="1" w:styleId="TableauNormal">

</xml_diff>